<commit_message>
Reframe business case: GreenGuard as vision + MLOps platform for chemical-free weeding robots
Stronger, defensible narrative tied to herbicide bans (e.g. France Loi Labbe) and the autonomous-weeding market, with the MLOps loop (drift + retraining + monitoring) justified as the product's reliability backbone. Adds a business-outcome -> ML-metric -> monitoring-signal mapping and an indicative business case to the cahier des charges. Regenerated presentation.pptx (18 slides) and cahier_des_charges.docx; aligned the CI/CD narrative with the new manifest-validation job.

Co-Authored-By: Claude Opus 4.8 (1M context) <noreply@anthropic.com>
</commit_message>
<xml_diff>
--- a/deliverables/cahier_des_charges.docx
+++ b/deliverables/cahier_des_charges.docx
@@ -2,31 +2,6 @@
 <file path=word/document.xml><?xml version="1.0" encoding="utf-8"?>
 <w:document xmlns:wpc="http://schemas.microsoft.com/office/word/2010/wordprocessingCanvas" xmlns:mo="http://schemas.microsoft.com/office/mac/office/2008/main" xmlns:mc="http://schemas.openxmlformats.org/markup-compatibility/2006" xmlns:mv="urn:schemas-microsoft-com:mac:vml" xmlns:o="urn:schemas-microsoft-com:office:office" xmlns:r="http://schemas.openxmlformats.org/officeDocument/2006/relationships" xmlns:m="http://schemas.openxmlformats.org/officeDocument/2006/math" xmlns:v="urn:schemas-microsoft-com:vml" xmlns:wp14="http://schemas.microsoft.com/office/word/2010/wordprocessingDrawing" xmlns:wp="http://schemas.openxmlformats.org/drawingml/2006/wordprocessingDrawing" xmlns:w10="urn:schemas-microsoft-com:office:word" xmlns:w="http://schemas.openxmlformats.org/wordprocessingml/2006/main" xmlns:w14="http://schemas.microsoft.com/office/word/2010/wordml" xmlns:wpg="http://schemas.microsoft.com/office/word/2010/wordprocessingGroup" xmlns:wpi="http://schemas.microsoft.com/office/word/2010/wordprocessingInk" xmlns:wne="http://schemas.microsoft.com/office/word/2006/wordml" xmlns:wps="http://schemas.microsoft.com/office/word/2010/wordprocessingShape" mc:Ignorable="w14 wp14">
   <w:body>
-    <w:p>
-      <w:pPr>
-        <w:pStyle w:val="Title"/>
-        <w:jc w:val="left"/>
-      </w:pPr>
-      <w:r>
-        <w:rPr>
-          <w:rFonts w:ascii="Segoe UI" w:hAnsi="Segoe UI"/>
-          <w:b/>
-          <w:color w:val="00A651"/>
-          <w:sz w:val="52"/>
-        </w:rPr>
-        <w:t>Cahier des Charges: GreenGuard AI Solution</w:t>
-      </w:r>
-    </w:p>
-    <w:p>
-      <w:r>
-        <w:rPr>
-          <w:rFonts w:ascii="Segoe UI" w:hAnsi="Segoe UI"/>
-          <w:i/>
-          <w:color w:val="6D7278"/>
-        </w:rPr>
-        <w:t>Bloc 4 - Artificial Intelligence Solutions - MLOps Dandelion Classifier</w:t>
-      </w:r>
-    </w:p>
     <w:p>
       <w:pPr>
         <w:pStyle w:val="Heading1"/>
@@ -56,7 +31,7 @@
           <w:b w:val="0"/>
           <w:color w:val="3C464B"/>
         </w:rPr>
-        <w:t xml:space="preserve"> GreenGuard - Automated Weed Detection for Smart Gardening </w:t>
+        <w:t xml:space="preserve"> GreenGuard - Vision and MLOps Platform for Autonomous Chemical-Free Weeding Robots </w:t>
       </w:r>
       <w:r>
         <w:rPr>
@@ -129,8 +104,68 @@
           <w:b w:val="0"/>
           <w:color w:val="3C464B"/>
         </w:rPr>
-        <w:t xml:space="preserve">Home gardeners and grounds-keepers routinely apply herbicide to entire lawns to remove a handful of weeds - wasteful, costly, and environmentally harmful. </w:t>
+        <w:t xml:space="preserve">Chemical weed control is being phased out. Regulations such as France's Loi Labbe ban synthetic herbicides in public green spaces and private gardens, organic farming forbids them, and grounds-care faces a chronic labour shortage. The emerging answer is the </w:t>
       </w:r>
+      <w:r>
+        <w:rPr>
+          <w:rFonts w:ascii="Segoe UI" w:hAnsi="Segoe UI"/>
+          <w:b/>
+          <w:color w:val="3C464B"/>
+        </w:rPr>
+        <w:t>autonomous weeding robot</w:t>
+      </w:r>
+      <w:r>
+        <w:rPr>
+          <w:rFonts w:ascii="Segoe UI" w:hAnsi="Segoe UI"/>
+          <w:b w:val="0"/>
+          <w:color w:val="3C464B"/>
+        </w:rPr>
+        <w:t>: a machine that drives over a field, lawn or roadside and removes weeds mechanically, with no chemicals.</w:t>
+      </w:r>
+    </w:p>
+    <w:p>
+      <w:r>
+        <w:rPr>
+          <w:rFonts w:ascii="Segoe UI" w:hAnsi="Segoe UI"/>
+          <w:b w:val="0"/>
+          <w:color w:val="3C464B"/>
+        </w:rPr>
+        <w:t xml:space="preserve">Such a robot is only as good as its eyes. For every patch it passes it must decide, in real time, whether it sees a </w:t>
+      </w:r>
+      <w:r>
+        <w:rPr>
+          <w:rFonts w:ascii="Segoe UI" w:hAnsi="Segoe UI"/>
+          <w:b/>
+          <w:color w:val="3C464B"/>
+        </w:rPr>
+        <w:t>weed</w:t>
+      </w:r>
+      <w:r>
+        <w:rPr>
+          <w:rFonts w:ascii="Segoe UI" w:hAnsi="Segoe UI"/>
+          <w:b w:val="0"/>
+          <w:color w:val="3C464B"/>
+        </w:rPr>
+        <w:t xml:space="preserve"> (here, a dandelion, to be removed) or the </w:t>
+      </w:r>
+      <w:r>
+        <w:rPr>
+          <w:rFonts w:ascii="Segoe UI" w:hAnsi="Segoe UI"/>
+          <w:b/>
+          <w:color w:val="3C464B"/>
+        </w:rPr>
+        <w:t>crop / turf</w:t>
+      </w:r>
+      <w:r>
+        <w:rPr>
+          <w:rFonts w:ascii="Segoe UI" w:hAnsi="Segoe UI"/>
+          <w:b w:val="0"/>
+          <w:color w:val="3C464B"/>
+        </w:rPr>
+        <w:t xml:space="preserve"> (here, grass, to be left untouched). Cut the wrong thing and it damages the very lawn or crop it is meant to protect.</w:t>
+      </w:r>
+    </w:p>
+    <w:p>
       <w:r>
         <w:rPr>
           <w:rFonts w:ascii="Segoe UI" w:hAnsi="Segoe UI"/>
@@ -145,15 +180,17 @@
           <w:b w:val="0"/>
           <w:color w:val="3C464B"/>
         </w:rPr>
-        <w:t xml:space="preserve"> is a smart-gardening assistant: the user photographs a patch of lawn from a mobile app and the system flags whether it contains </w:t>
+        <w:t xml:space="preserve"> is that perception brain and the MLOps platform behind it: a binary image classifier (dandelion vs grass) served at the edge, wrapped in the industrialised pipeline that keeps it accurate as it meets new sites, seasons and lighting. This document specifies the solution as a production-grade MLOps system: not just a model, but a serving API, automated deployment, monitoring, and self-maintenance through drift-triggered retraining.</w:t>
       </w:r>
+    </w:p>
+    <w:p>
       <w:r>
         <w:rPr>
           <w:rFonts w:ascii="Segoe UI" w:hAnsi="Segoe UI"/>
           <w:b/>
           <w:color w:val="3C464B"/>
         </w:rPr>
-        <w:t>dandelions</w:t>
+        <w:t>Why MLOps is not optional here.</w:t>
       </w:r>
       <w:r>
         <w:rPr>
@@ -161,23 +198,21 @@
           <w:b w:val="0"/>
           <w:color w:val="3C464B"/>
         </w:rPr>
-        <w:t xml:space="preserve"> (a weed to spot-treat) or is </w:t>
+        <w:t xml:space="preserve"> A fleet of robots works across many fields and seasons, so the images it sees drift continuously. Without automatic drift detection and retraining the model silently degrades, and a degraded model means a robot that uproots the crop or leaves weeds standing. Monitoring and retraining are therefore the reliability backbone of the product, not add-ons.</w:t>
       </w:r>
+    </w:p>
+    <w:p>
+      <w:pPr>
+        <w:pStyle w:val="Heading3"/>
+      </w:pPr>
       <w:r>
         <w:rPr>
           <w:rFonts w:ascii="Segoe UI" w:hAnsi="Segoe UI"/>
           <w:b/>
-          <w:color w:val="3C464B"/>
+          <w:color w:val="008C45"/>
+          <w:sz w:val="26"/>
         </w:rPr>
-        <w:t>grass</w:t>
-      </w:r>
-      <w:r>
-        <w:rPr>
-          <w:rFonts w:ascii="Segoe UI" w:hAnsi="Segoe UI"/>
-          <w:b w:val="0"/>
-          <w:color w:val="3C464B"/>
-        </w:rPr>
-        <w:t xml:space="preserve"> (leave alone). This enables targeted, spot-treatment instead of blanket spraying.</w:t>
+        <w:t>Indicative business case</w:t>
       </w:r>
     </w:p>
     <w:p>
@@ -187,7 +222,110 @@
           <w:b w:val="0"/>
           <w:color w:val="3C464B"/>
         </w:rPr>
-        <w:t>The AI component is a binary image classifier (dandelion vs grass). This document specifies that component as a production-grade, industrialised MLOps solution: not just a model, but a serving API, automated deployment, monitoring, and self-maintenance through retraining.</w:t>
+        <w:t>The driver is regulatory and economic, not a marginal optimisation:</w:t>
+      </w:r>
+    </w:p>
+    <w:p>
+      <w:pPr>
+        <w:pStyle w:val="ListBullet"/>
+      </w:pPr>
+      <w:r>
+        <w:rPr>
+          <w:rFonts w:ascii="Segoe UI" w:hAnsi="Segoe UI"/>
+          <w:b/>
+          <w:color w:val="3C464B"/>
+        </w:rPr>
+        <w:t>Compliance:</w:t>
+      </w:r>
+      <w:r>
+        <w:rPr>
+          <w:rFonts w:ascii="Segoe UI" w:hAnsi="Segoe UI"/>
+          <w:b w:val="0"/>
+          <w:color w:val="3C464B"/>
+        </w:rPr>
+        <w:t xml:space="preserve"> where herbicides are banned (for example France's Loi Labbe for</w:t>
+      </w:r>
+    </w:p>
+    <w:p>
+      <w:r>
+        <w:rPr>
+          <w:rFonts w:ascii="Segoe UI" w:hAnsi="Segoe UI"/>
+          <w:b w:val="0"/>
+          <w:color w:val="3C464B"/>
+        </w:rPr>
+        <w:t>public green spaces), chemical weeding is simply not an option; a chemical-free robot is the compliant one.</w:t>
+      </w:r>
+    </w:p>
+    <w:p>
+      <w:pPr>
+        <w:pStyle w:val="ListBullet"/>
+      </w:pPr>
+      <w:r>
+        <w:rPr>
+          <w:rFonts w:ascii="Segoe UI" w:hAnsi="Segoe UI"/>
+          <w:b/>
+          <w:color w:val="3C464B"/>
+        </w:rPr>
+        <w:t>Labour:</w:t>
+      </w:r>
+      <w:r>
+        <w:rPr>
+          <w:rFonts w:ascii="Segoe UI" w:hAnsi="Segoe UI"/>
+          <w:b w:val="0"/>
+          <w:color w:val="3C464B"/>
+        </w:rPr>
+        <w:t xml:space="preserve"> autonomous operation removes the recurring cost of manual weeding,</w:t>
+      </w:r>
+    </w:p>
+    <w:p>
+      <w:r>
+        <w:rPr>
+          <w:rFonts w:ascii="Segoe UI" w:hAnsi="Segoe UI"/>
+          <w:b w:val="0"/>
+          <w:color w:val="3C464B"/>
+        </w:rPr>
+        <w:t>the main expense in pesticide-free grounds care.</w:t>
+      </w:r>
+    </w:p>
+    <w:p>
+      <w:pPr>
+        <w:pStyle w:val="ListBullet"/>
+      </w:pPr>
+      <w:r>
+        <w:rPr>
+          <w:rFonts w:ascii="Segoe UI" w:hAnsi="Segoe UI"/>
+          <w:b/>
+          <w:color w:val="3C464B"/>
+        </w:rPr>
+        <w:t>Asset protection:</w:t>
+      </w:r>
+      <w:r>
+        <w:rPr>
+          <w:rFonts w:ascii="Segoe UI" w:hAnsi="Segoe UI"/>
+          <w:b w:val="0"/>
+          <w:color w:val="3C464B"/>
+        </w:rPr>
+        <w:t xml:space="preserve"> accurate perception avoids destroying the crop or turf the</w:t>
+      </w:r>
+    </w:p>
+    <w:p>
+      <w:r>
+        <w:rPr>
+          <w:rFonts w:ascii="Segoe UI" w:hAnsi="Segoe UI"/>
+          <w:b w:val="0"/>
+          <w:color w:val="3C464B"/>
+        </w:rPr>
+        <w:t>robot exists to protect.</w:t>
+      </w:r>
+    </w:p>
+    <w:p>
+      <w:r>
+        <w:rPr>
+          <w:rFonts w:ascii="Segoe UI" w:hAnsi="Segoe UI"/>
+          <w:b w:val="0"/>
+          <w:color w:val="3C464B"/>
+        </w:rPr>
+        <w:t>Exact figures are deployment-specific. The point for this specification is that the model's accuracy, and its sustained accuracy over time, translate directly into chemicals avoided, labour saved and crop protected, which is why the MLOps loop (monitoring plus retraining) is core to the value rather than peripheral.</w:t>
       </w:r>
     </w:p>
     <w:p>
@@ -466,6 +604,408 @@
     <w:p/>
     <w:p>
       <w:pPr>
+        <w:pStyle w:val="Heading3"/>
+      </w:pPr>
+      <w:r>
+        <w:rPr>
+          <w:rFonts w:ascii="Segoe UI" w:hAnsi="Segoe UI"/>
+          <w:b/>
+          <w:color w:val="008C45"/>
+          <w:sz w:val="26"/>
+        </w:rPr>
+        <w:t>From business value to monitored metrics</w:t>
+      </w:r>
+    </w:p>
+    <w:p>
+      <w:r>
+        <w:rPr>
+          <w:rFonts w:ascii="Segoe UI" w:hAnsi="Segoe UI"/>
+          <w:b w:val="0"/>
+          <w:color w:val="3C464B"/>
+        </w:rPr>
+        <w:t>Monitoring is wired to business outcomes, not just technical health:</w:t>
+      </w:r>
+    </w:p>
+    <w:tbl>
+      <w:tblPr>
+        <w:tblStyle w:val="TableGrid"/>
+        <w:tblW w:type="auto" w:w="0"/>
+        <w:tblLook w:firstColumn="1" w:firstRow="1" w:lastColumn="0" w:lastRow="0" w:noHBand="0" w:noVBand="1" w:val="04A0"/>
+      </w:tblPr>
+      <w:tblGrid>
+        <w:gridCol w:w="2880"/>
+        <w:gridCol w:w="2880"/>
+        <w:gridCol w:w="2880"/>
+      </w:tblGrid>
+      <w:tr>
+        <w:tc>
+          <w:tcPr>
+            <w:tcW w:type="dxa" w:w="2880"/>
+            <w:shd w:val="clear" w:color="auto" w:fill="00A651"/>
+          </w:tcPr>
+          <w:p>
+            <w:r/>
+            <w:r>
+              <w:rPr>
+                <w:rFonts w:ascii="Segoe UI" w:hAnsi="Segoe UI"/>
+                <w:b/>
+                <w:color w:val="FFFFFF"/>
+                <w:sz w:val="22"/>
+              </w:rPr>
+              <w:t>Business outcome</w:t>
+            </w:r>
+          </w:p>
+        </w:tc>
+        <w:tc>
+          <w:tcPr>
+            <w:tcW w:type="dxa" w:w="2880"/>
+            <w:shd w:val="clear" w:color="auto" w:fill="00A651"/>
+          </w:tcPr>
+          <w:p>
+            <w:r/>
+            <w:r>
+              <w:rPr>
+                <w:rFonts w:ascii="Segoe UI" w:hAnsi="Segoe UI"/>
+                <w:b/>
+                <w:color w:val="FFFFFF"/>
+                <w:sz w:val="22"/>
+              </w:rPr>
+              <w:t>ML metric</w:t>
+            </w:r>
+          </w:p>
+        </w:tc>
+        <w:tc>
+          <w:tcPr>
+            <w:tcW w:type="dxa" w:w="2880"/>
+            <w:shd w:val="clear" w:color="auto" w:fill="00A651"/>
+          </w:tcPr>
+          <w:p>
+            <w:r/>
+            <w:r>
+              <w:rPr>
+                <w:rFonts w:ascii="Segoe UI" w:hAnsi="Segoe UI"/>
+                <w:b/>
+                <w:color w:val="FFFFFF"/>
+                <w:sz w:val="22"/>
+              </w:rPr>
+              <w:t>Live monitoring signal</w:t>
+            </w:r>
+          </w:p>
+        </w:tc>
+      </w:tr>
+      <w:tr>
+        <w:tc>
+          <w:tcPr>
+            <w:tcW w:type="dxa" w:w="2880"/>
+          </w:tcPr>
+          <w:p>
+            <w:r/>
+            <w:r>
+              <w:rPr>
+                <w:rFonts w:ascii="Segoe UI" w:hAnsi="Segoe UI"/>
+                <w:b w:val="0"/>
+                <w:color w:val="3C464B"/>
+              </w:rPr>
+              <w:t>Crop / turf safety (never cut the crop)</w:t>
+            </w:r>
+          </w:p>
+        </w:tc>
+        <w:tc>
+          <w:tcPr>
+            <w:tcW w:type="dxa" w:w="2880"/>
+          </w:tcPr>
+          <w:p>
+            <w:r/>
+            <w:r>
+              <w:rPr>
+                <w:rFonts w:ascii="Segoe UI" w:hAnsi="Segoe UI"/>
+                <w:b w:val="0"/>
+                <w:color w:val="3C464B"/>
+              </w:rPr>
+              <w:t>per-class precision and recall, confusion matrix</w:t>
+            </w:r>
+          </w:p>
+        </w:tc>
+        <w:tc>
+          <w:tcPr>
+            <w:tcW w:type="dxa" w:w="2880"/>
+          </w:tcPr>
+          <w:p>
+            <w:r/>
+            <w:r>
+              <w:rPr>
+                <w:rFonts w:ascii="Segoe UI" w:hAnsi="Segoe UI"/>
+                <w:b w:val="0"/>
+                <w:color w:val="3C464B"/>
+              </w:rPr>
+              <w:t>prediction mix, drift (PSI), retrain events</w:t>
+            </w:r>
+          </w:p>
+        </w:tc>
+      </w:tr>
+      <w:tr>
+        <w:tc>
+          <w:tcPr>
+            <w:tcW w:type="dxa" w:w="2880"/>
+            <w:shd w:val="clear" w:color="auto" w:fill="EEF1F2"/>
+          </w:tcPr>
+          <w:p>
+            <w:r/>
+            <w:r>
+              <w:rPr>
+                <w:rFonts w:ascii="Segoe UI" w:hAnsi="Segoe UI"/>
+                <w:b w:val="0"/>
+                <w:color w:val="3C464B"/>
+              </w:rPr>
+              <w:t>Effective weeding (do not miss weeds)</w:t>
+            </w:r>
+          </w:p>
+        </w:tc>
+        <w:tc>
+          <w:tcPr>
+            <w:tcW w:type="dxa" w:w="2880"/>
+            <w:shd w:val="clear" w:color="auto" w:fill="EEF1F2"/>
+          </w:tcPr>
+          <w:p>
+            <w:r/>
+            <w:r>
+              <w:rPr>
+                <w:rFonts w:ascii="Segoe UI" w:hAnsi="Segoe UI"/>
+                <w:b w:val="0"/>
+                <w:color w:val="3C464B"/>
+              </w:rPr>
+              <w:t>macro-F1, recall on the weed class</w:t>
+            </w:r>
+          </w:p>
+        </w:tc>
+        <w:tc>
+          <w:tcPr>
+            <w:tcW w:type="dxa" w:w="2880"/>
+            <w:shd w:val="clear" w:color="auto" w:fill="EEF1F2"/>
+          </w:tcPr>
+          <w:p>
+            <w:r/>
+            <w:r>
+              <w:rPr>
+                <w:rFonts w:ascii="Segoe UI" w:hAnsi="Segoe UI"/>
+                <w:b w:val="0"/>
+                <w:color w:val="3C464B"/>
+              </w:rPr>
+              <w:t>release-gate macro-F1; drift flag in Grafana</w:t>
+            </w:r>
+          </w:p>
+        </w:tc>
+      </w:tr>
+      <w:tr>
+        <w:tc>
+          <w:tcPr>
+            <w:tcW w:type="dxa" w:w="2880"/>
+          </w:tcPr>
+          <w:p>
+            <w:r/>
+            <w:r>
+              <w:rPr>
+                <w:rFonts w:ascii="Segoe UI" w:hAnsi="Segoe UI"/>
+                <w:b w:val="0"/>
+                <w:color w:val="3C464B"/>
+              </w:rPr>
+              <w:t>Real-time operation on a moving robot</w:t>
+            </w:r>
+          </w:p>
+        </w:tc>
+        <w:tc>
+          <w:tcPr>
+            <w:tcW w:type="dxa" w:w="2880"/>
+          </w:tcPr>
+          <w:p>
+            <w:r/>
+            <w:r>
+              <w:rPr>
+                <w:rFonts w:ascii="Segoe UI" w:hAnsi="Segoe UI"/>
+                <w:b w:val="0"/>
+                <w:color w:val="3C464B"/>
+              </w:rPr>
+              <w:t>inference latency</w:t>
+            </w:r>
+          </w:p>
+        </w:tc>
+        <w:tc>
+          <w:tcPr>
+            <w:tcW w:type="dxa" w:w="2880"/>
+          </w:tcPr>
+          <w:p>
+            <w:r/>
+            <w:r>
+              <w:rPr>
+                <w:rFonts w:ascii="Segoe UI" w:hAnsi="Segoe UI"/>
+                <w:b w:val="0"/>
+                <w:color w:val="3C464B"/>
+              </w:rPr>
+              <w:t>p90 prediction_latency_seconds (Prometheus)</w:t>
+            </w:r>
+          </w:p>
+        </w:tc>
+      </w:tr>
+      <w:tr>
+        <w:tc>
+          <w:tcPr>
+            <w:tcW w:type="dxa" w:w="2880"/>
+            <w:shd w:val="clear" w:color="auto" w:fill="EEF1F2"/>
+          </w:tcPr>
+          <w:p>
+            <w:r/>
+            <w:r>
+              <w:rPr>
+                <w:rFonts w:ascii="Segoe UI" w:hAnsi="Segoe UI"/>
+                <w:b w:val="0"/>
+                <w:color w:val="3C464B"/>
+              </w:rPr>
+              <w:t>Sustained accuracy across sites and seasons</w:t>
+            </w:r>
+          </w:p>
+        </w:tc>
+        <w:tc>
+          <w:tcPr>
+            <w:tcW w:type="dxa" w:w="2880"/>
+            <w:shd w:val="clear" w:color="auto" w:fill="EEF1F2"/>
+          </w:tcPr>
+          <w:p>
+            <w:r/>
+            <w:r>
+              <w:rPr>
+                <w:rFonts w:ascii="Segoe UI" w:hAnsi="Segoe UI"/>
+                <w:b w:val="0"/>
+                <w:color w:val="3C464B"/>
+              </w:rPr>
+              <w:t>drift magnitude, retrain cadence</w:t>
+            </w:r>
+          </w:p>
+        </w:tc>
+        <w:tc>
+          <w:tcPr>
+            <w:tcW w:type="dxa" w:w="2880"/>
+            <w:shd w:val="clear" w:color="auto" w:fill="EEF1F2"/>
+          </w:tcPr>
+          <w:p>
+            <w:r/>
+            <w:r>
+              <w:rPr>
+                <w:rFonts w:ascii="Segoe UI" w:hAnsi="Segoe UI"/>
+                <w:b w:val="0"/>
+                <w:color w:val="3C464B"/>
+              </w:rPr>
+              <w:t>dataset_drift flag, drift_share, retrain runs</w:t>
+            </w:r>
+          </w:p>
+        </w:tc>
+      </w:tr>
+      <w:tr>
+        <w:tc>
+          <w:tcPr>
+            <w:tcW w:type="dxa" w:w="2880"/>
+          </w:tcPr>
+          <w:p>
+            <w:r/>
+            <w:r>
+              <w:rPr>
+                <w:rFonts w:ascii="Segoe UI" w:hAnsi="Segoe UI"/>
+                <w:b w:val="0"/>
+                <w:color w:val="3C464B"/>
+              </w:rPr>
+              <w:t>Low maintenance cost</w:t>
+            </w:r>
+          </w:p>
+        </w:tc>
+        <w:tc>
+          <w:tcPr>
+            <w:tcW w:type="dxa" w:w="2880"/>
+          </w:tcPr>
+          <w:p>
+            <w:r/>
+            <w:r>
+              <w:rPr>
+                <w:rFonts w:ascii="Segoe UI" w:hAnsi="Segoe UI"/>
+                <w:b w:val="0"/>
+                <w:color w:val="3C464B"/>
+              </w:rPr>
+              <w:t>automation coverage</w:t>
+            </w:r>
+          </w:p>
+        </w:tc>
+        <w:tc>
+          <w:tcPr>
+            <w:tcW w:type="dxa" w:w="2880"/>
+          </w:tcPr>
+          <w:p>
+            <w:r/>
+            <w:r>
+              <w:rPr>
+                <w:rFonts w:ascii="Segoe UI" w:hAnsi="Segoe UI"/>
+                <w:b w:val="0"/>
+                <w:color w:val="3C464B"/>
+              </w:rPr>
+              <w:t>green CI/CD, automated drift-triggered retraining</w:t>
+            </w:r>
+          </w:p>
+        </w:tc>
+      </w:tr>
+      <w:tr>
+        <w:tc>
+          <w:tcPr>
+            <w:tcW w:type="dxa" w:w="2880"/>
+            <w:shd w:val="clear" w:color="auto" w:fill="EEF1F2"/>
+          </w:tcPr>
+          <w:p>
+            <w:r/>
+            <w:r>
+              <w:rPr>
+                <w:rFonts w:ascii="Segoe UI" w:hAnsi="Segoe UI"/>
+                <w:b w:val="0"/>
+                <w:color w:val="3C464B"/>
+              </w:rPr>
+              <w:t>Herbicide avoided and uptime</w:t>
+            </w:r>
+          </w:p>
+        </w:tc>
+        <w:tc>
+          <w:tcPr>
+            <w:tcW w:type="dxa" w:w="2880"/>
+            <w:shd w:val="clear" w:color="auto" w:fill="EEF1F2"/>
+          </w:tcPr>
+          <w:p>
+            <w:r/>
+            <w:r>
+              <w:rPr>
+                <w:rFonts w:ascii="Segoe UI" w:hAnsi="Segoe UI"/>
+                <w:b w:val="0"/>
+                <w:color w:val="3C464B"/>
+              </w:rPr>
+              <w:t>model availability</w:t>
+            </w:r>
+          </w:p>
+        </w:tc>
+        <w:tc>
+          <w:tcPr>
+            <w:tcW w:type="dxa" w:w="2880"/>
+            <w:shd w:val="clear" w:color="auto" w:fill="EEF1F2"/>
+          </w:tcPr>
+          <w:p>
+            <w:r/>
+            <w:r>
+              <w:rPr>
+                <w:rFonts w:ascii="Segoe UI" w:hAnsi="Segoe UI"/>
+                <w:b w:val="0"/>
+                <w:color w:val="3C464B"/>
+              </w:rPr>
+              <w:t>predictions_total, /health readiness</w:t>
+            </w:r>
+          </w:p>
+        </w:tc>
+      </w:tr>
+    </w:tbl>
+    <w:p/>
+    <w:p>
+      <w:pPr>
         <w:pStyle w:val="Heading2"/>
       </w:pPr>
       <w:r>
@@ -511,7 +1051,7 @@
           <w:b w:val="0"/>
           <w:color w:val="3C464B"/>
         </w:rPr>
-        <w:t xml:space="preserve"> the mobile application front-end, user account management, and multi-species weed taxonomy (future work). The model is intentionally binary.</w:t>
+        <w:t xml:space="preserve"> the robot hardware and its mechanical weeding actuator, the on-robot edge-runtime integration, and a multi-species weed taxonomy (future work). The model is intentionally binary (weed vs crop) as the proof-of-concept perception core.</w:t>
       </w:r>
     </w:p>
     <w:p>
@@ -694,7 +1234,7 @@
                 <w:b w:val="0"/>
                 <w:color w:val="3C464B"/>
               </w:rPr>
-              <w:t>End user (gardener)</w:t>
+              <w:t>Robotics OEM</w:t>
             </w:r>
           </w:p>
         </w:tc>
@@ -711,7 +1251,7 @@
                 <w:b w:val="0"/>
                 <w:color w:val="3C464B"/>
               </w:rPr>
-              <w:t>Fast, trustworthy predictions from a photo</w:t>
+              <w:t>Embeds the perception module; needs a stable, updatable model API</w:t>
             </w:r>
           </w:p>
         </w:tc>
@@ -729,6 +1269,41 @@
                 <w:b w:val="0"/>
                 <w:color w:val="3C464B"/>
               </w:rPr>
+              <w:t>Robot operator / grounds team</w:t>
+            </w:r>
+          </w:p>
+        </w:tc>
+        <w:tc>
+          <w:tcPr>
+            <w:tcW w:type="dxa" w:w="4320"/>
+          </w:tcPr>
+          <w:p>
+            <w:r/>
+            <w:r>
+              <w:rPr>
+                <w:rFonts w:ascii="Segoe UI" w:hAnsi="Segoe UI"/>
+                <w:b w:val="0"/>
+                <w:color w:val="3C464B"/>
+              </w:rPr>
+              <w:t>Reliable weed-vs-crop calls so the robot removes only weeds</w:t>
+            </w:r>
+          </w:p>
+        </w:tc>
+      </w:tr>
+      <w:tr>
+        <w:tc>
+          <w:tcPr>
+            <w:tcW w:type="dxa" w:w="4320"/>
+            <w:shd w:val="clear" w:color="auto" w:fill="EEF1F2"/>
+          </w:tcPr>
+          <w:p>
+            <w:r/>
+            <w:r>
+              <w:rPr>
+                <w:rFonts w:ascii="Segoe UI" w:hAnsi="Segoe UI"/>
+                <w:b w:val="0"/>
+                <w:color w:val="3C464B"/>
+              </w:rPr>
               <w:t>RNCP jury</w:t>
             </w:r>
           </w:p>
@@ -736,6 +1311,7 @@
         <w:tc>
           <w:tcPr>
             <w:tcW w:type="dxa" w:w="4320"/>
+            <w:shd w:val="clear" w:color="auto" w:fill="EEF1F2"/>
           </w:tcPr>
           <w:p>
             <w:r/>
@@ -1529,7 +2105,7 @@
           <w:b w:val="0"/>
           <w:color w:val="3C464B"/>
         </w:rPr>
-        <w:t xml:space="preserve"> on every push to `main` - run tests, build the container image, push</w:t>
+        <w:t xml:space="preserve"> on every push to `main` - run tests, build and publish the container</w:t>
       </w:r>
     </w:p>
     <w:p>
@@ -1539,7 +2115,7 @@
           <w:b w:val="0"/>
           <w:color w:val="3C464B"/>
         </w:rPr>
-        <w:t>to the registry, and deploy to Kubernetes (Minikube) with rollout verification.</w:t>
+        <w:t>image to the registry, and validate the Kubernetes deployment manifests (schema-checked, offline). The same manifests deploy to a local Minikube cluster.</w:t>
       </w:r>
     </w:p>
     <w:p>
@@ -2472,7 +3048,17 @@
           <w:b w:val="0"/>
           <w:color w:val="3C464B"/>
         </w:rPr>
-        <w:t>All tests green in CI; image built and deployed to the cluster.</w:t>
+        <w:t>All tests green in CI; image built and published; Kubernetes manifests validated.</w:t>
+      </w:r>
+    </w:p>
+    <w:p>
+      <w:r>
+        <w:rPr>
+          <w:rFonts w:ascii="Segoe UI" w:hAnsi="Segoe UI"/>
+          <w:b w:val="0"/>
+          <w:color w:val="3C464B"/>
+        </w:rPr>
+        <w:t>The stack deploys to a local Minikube cluster.</w:t>
       </w:r>
     </w:p>
     <w:p>

</xml_diff>